<commit_message>
Expand guides 01-23 and trim workshops 25-28
- Guides 01-23: new 'Background for Staff' section with a timeline or key points for each topic
- Workshops 25-28: worksheets cut from 7-8 pages to 5 (role play, gap fill and written Big Question removed; reading text tightened); guides' session flow and answer keys updated to match

Co-Authored-By: Claude Opus 5.5 <noreply@anthropic.com>
Claude-Session: https://claude.ai/code/session_01SPv82zmeRu4bZc3xAHocQk
</commit_message>
<xml_diff>
--- a/01_Kemet_Facilitator_Guide.docx
+++ b/01_Kemet_Facilitator_Guide.docx
@@ -1482,7 +1482,692 @@
           <w:color w:val="1A1A1A"/>
           <w:sz w:val="27"/>
         </w:rPr>
-        <w:t>5.  Delivery Notes</w:t>
+        <w:t xml:space="preserve">5.  Background for Staff</w:t>
+      </w:r>
+    </w:p>
+    <w:tbl>
+      <w:tblPr>
+        <w:tblW w:type="auto" w:w="0"/>
+        <w:jc w:val="center"/>
+        <w:tblLayout w:type="fixed"/>
+        <w:tblLook w:firstColumn="1" w:firstRow="1" w:lastColumn="0" w:lastRow="0" w:noHBand="0" w:noVBand="1" w:val="04A0"/>
+      </w:tblPr>
+      <w:tblGrid>
+        <w:gridCol w:w="2154"/>
+        <w:gridCol w:w="7087"/>
+      </w:tblGrid>
+      <w:tr>
+        <w:trPr>
+          <w:cantSplit/>
+        </w:trPr>
+        <w:tc>
+          <w:tcPr>
+            <w:tcW w:type="dxa" w:w="2154"/>
+            <w:tcBorders>
+              <w:top w:val="single" w:sz="6" w:space="0" w:color="007A3D"/>
+              <w:left w:val="single" w:sz="6" w:space="0" w:color="007A3D"/>
+              <w:bottom w:val="single" w:sz="6" w:space="0" w:color="007A3D"/>
+              <w:right w:val="single" w:sz="6" w:space="0" w:color="007A3D"/>
+            </w:tcBorders>
+            <w:shd w:val="clear" w:color="auto" w:fill="007A3D"/>
+            <w:tcMar>
+              <w:top w:w="80" w:type="dxa"/>
+              <w:left w:w="140" w:type="dxa"/>
+              <w:bottom w:w="80" w:type="dxa"/>
+              <w:right w:w="140" w:type="dxa"/>
+            </w:tcMar>
+          </w:tcPr>
+          <w:p>
+            <w:pPr>
+              <w:keepNext/>
+              <w:spacing w:after="0"/>
+            </w:pPr>
+            <w:r>
+              <w:rPr>
+                <w:rFonts w:ascii="Aptos" w:hAnsi="Aptos"/>
+                <w:b/>
+                <w:i w:val="0"/>
+                <w:color w:val="FFFFFF"/>
+                <w:sz w:val="21"/>
+              </w:rPr>
+              <w:t xml:space="preserve">When</w:t>
+            </w:r>
+          </w:p>
+        </w:tc>
+        <w:tc>
+          <w:tcPr>
+            <w:tcW w:type="dxa" w:w="7087"/>
+            <w:tcBorders>
+              <w:top w:val="single" w:sz="6" w:space="0" w:color="007A3D"/>
+              <w:left w:val="single" w:sz="6" w:space="0" w:color="007A3D"/>
+              <w:bottom w:val="single" w:sz="6" w:space="0" w:color="007A3D"/>
+              <w:right w:val="single" w:sz="6" w:space="0" w:color="007A3D"/>
+            </w:tcBorders>
+            <w:shd w:val="clear" w:color="auto" w:fill="007A3D"/>
+            <w:tcMar>
+              <w:top w:w="80" w:type="dxa"/>
+              <w:left w:w="140" w:type="dxa"/>
+              <w:bottom w:w="80" w:type="dxa"/>
+              <w:right w:w="140" w:type="dxa"/>
+            </w:tcMar>
+          </w:tcPr>
+          <w:p>
+            <w:pPr>
+              <w:keepNext/>
+              <w:spacing w:after="0"/>
+            </w:pPr>
+            <w:r>
+              <w:rPr>
+                <w:rFonts w:ascii="Aptos" w:hAnsi="Aptos"/>
+                <w:b/>
+                <w:i w:val="0"/>
+                <w:color w:val="FFFFFF"/>
+                <w:sz w:val="21"/>
+              </w:rPr>
+              <w:t xml:space="preserve">What happened</w:t>
+            </w:r>
+          </w:p>
+        </w:tc>
+      </w:tr>
+      <w:tr>
+        <w:trPr>
+          <w:cantSplit/>
+        </w:trPr>
+        <w:tc>
+          <w:tcPr>
+            <w:tcW w:type="dxa" w:w="2154"/>
+            <w:tcBorders>
+              <w:top w:val="single" w:sz="4" w:space="0" w:color="D9C58A"/>
+              <w:left w:val="single" w:sz="4" w:space="0" w:color="D9C58A"/>
+              <w:bottom w:val="single" w:sz="4" w:space="0" w:color="D9C58A"/>
+              <w:right w:val="single" w:sz="4" w:space="0" w:color="D9C58A"/>
+            </w:tcBorders>
+            <w:tcMar>
+              <w:top w:w="80" w:type="dxa"/>
+              <w:left w:w="140" w:type="dxa"/>
+              <w:bottom w:w="80" w:type="dxa"/>
+              <w:right w:w="140" w:type="dxa"/>
+            </w:tcMar>
+          </w:tcPr>
+          <w:p>
+            <w:pPr>
+              <w:keepNext/>
+              <w:spacing w:after="0"/>
+            </w:pPr>
+            <w:r>
+              <w:rPr>
+                <w:rFonts w:ascii="Aptos" w:hAnsi="Aptos"/>
+                <w:b w:val="0"/>
+                <w:i w:val="0"/>
+                <w:color w:val="1A1A1A"/>
+                <w:sz w:val="20"/>
+              </w:rPr>
+              <w:t xml:space="preserve">c. 3100 BC</w:t>
+            </w:r>
+          </w:p>
+        </w:tc>
+        <w:tc>
+          <w:tcPr>
+            <w:tcW w:type="dxa" w:w="7087"/>
+            <w:tcBorders>
+              <w:top w:val="single" w:sz="4" w:space="0" w:color="D9C58A"/>
+              <w:left w:val="single" w:sz="4" w:space="0" w:color="D9C58A"/>
+              <w:bottom w:val="single" w:sz="4" w:space="0" w:color="D9C58A"/>
+              <w:right w:val="single" w:sz="4" w:space="0" w:color="D9C58A"/>
+            </w:tcBorders>
+            <w:tcMar>
+              <w:top w:w="80" w:type="dxa"/>
+              <w:left w:w="140" w:type="dxa"/>
+              <w:bottom w:w="80" w:type="dxa"/>
+              <w:right w:w="140" w:type="dxa"/>
+            </w:tcMar>
+          </w:tcPr>
+          <w:p>
+            <w:pPr>
+              <w:keepNext/>
+              <w:spacing w:after="0"/>
+            </w:pPr>
+            <w:r>
+              <w:rPr>
+                <w:rFonts w:ascii="Aptos" w:hAnsi="Aptos"/>
+                <w:b w:val="0"/>
+                <w:i w:val="0"/>
+                <w:color w:val="1A1A1A"/>
+                <w:sz w:val="20"/>
+              </w:rPr>
+              <w:t xml:space="preserve">Upper and Lower Egypt are united into one kingdom under a pharaoh.</w:t>
+            </w:r>
+          </w:p>
+        </w:tc>
+      </w:tr>
+      <w:tr>
+        <w:trPr>
+          <w:cantSplit/>
+        </w:trPr>
+        <w:tc>
+          <w:tcPr>
+            <w:tcW w:type="dxa" w:w="2154"/>
+            <w:tcBorders>
+              <w:top w:val="single" w:sz="4" w:space="0" w:color="D9C58A"/>
+              <w:left w:val="single" w:sz="4" w:space="0" w:color="D9C58A"/>
+              <w:bottom w:val="single" w:sz="4" w:space="0" w:color="D9C58A"/>
+              <w:right w:val="single" w:sz="4" w:space="0" w:color="D9C58A"/>
+            </w:tcBorders>
+            <w:tcMar>
+              <w:top w:w="80" w:type="dxa"/>
+              <w:left w:w="140" w:type="dxa"/>
+              <w:bottom w:w="80" w:type="dxa"/>
+              <w:right w:w="140" w:type="dxa"/>
+            </w:tcMar>
+          </w:tcPr>
+          <w:p>
+            <w:pPr>
+              <w:keepNext/>
+              <w:spacing w:after="0"/>
+            </w:pPr>
+            <w:r>
+              <w:rPr>
+                <w:rFonts w:ascii="Aptos" w:hAnsi="Aptos"/>
+                <w:b w:val="0"/>
+                <w:i w:val="0"/>
+                <w:color w:val="1A1A1A"/>
+                <w:sz w:val="20"/>
+              </w:rPr>
+              <w:t xml:space="preserve">c. 2650 BC</w:t>
+            </w:r>
+          </w:p>
+        </w:tc>
+        <w:tc>
+          <w:tcPr>
+            <w:tcW w:type="dxa" w:w="7087"/>
+            <w:tcBorders>
+              <w:top w:val="single" w:sz="4" w:space="0" w:color="D9C58A"/>
+              <w:left w:val="single" w:sz="4" w:space="0" w:color="D9C58A"/>
+              <w:bottom w:val="single" w:sz="4" w:space="0" w:color="D9C58A"/>
+              <w:right w:val="single" w:sz="4" w:space="0" w:color="D9C58A"/>
+            </w:tcBorders>
+            <w:tcMar>
+              <w:top w:w="80" w:type="dxa"/>
+              <w:left w:w="140" w:type="dxa"/>
+              <w:bottom w:w="80" w:type="dxa"/>
+              <w:right w:w="140" w:type="dxa"/>
+            </w:tcMar>
+          </w:tcPr>
+          <w:p>
+            <w:pPr>
+              <w:keepNext/>
+              <w:spacing w:after="0"/>
+            </w:pPr>
+            <w:r>
+              <w:rPr>
+                <w:rFonts w:ascii="Aptos" w:hAnsi="Aptos"/>
+                <w:b w:val="0"/>
+                <w:i w:val="0"/>
+                <w:color w:val="1A1A1A"/>
+                <w:sz w:val="20"/>
+              </w:rPr>
+              <w:t xml:space="preserve">Imhotep designs the Step Pyramid of King Djoser at Saqqara, the first large stone pyramid.</w:t>
+            </w:r>
+          </w:p>
+        </w:tc>
+      </w:tr>
+      <w:tr>
+        <w:trPr>
+          <w:cantSplit/>
+        </w:trPr>
+        <w:tc>
+          <w:tcPr>
+            <w:tcW w:type="dxa" w:w="2154"/>
+            <w:tcBorders>
+              <w:top w:val="single" w:sz="4" w:space="0" w:color="D9C58A"/>
+              <w:left w:val="single" w:sz="4" w:space="0" w:color="D9C58A"/>
+              <w:bottom w:val="single" w:sz="4" w:space="0" w:color="D9C58A"/>
+              <w:right w:val="single" w:sz="4" w:space="0" w:color="D9C58A"/>
+            </w:tcBorders>
+            <w:tcMar>
+              <w:top w:w="80" w:type="dxa"/>
+              <w:left w:w="140" w:type="dxa"/>
+              <w:bottom w:w="80" w:type="dxa"/>
+              <w:right w:w="140" w:type="dxa"/>
+            </w:tcMar>
+          </w:tcPr>
+          <w:p>
+            <w:pPr>
+              <w:keepNext/>
+              <w:spacing w:after="0"/>
+            </w:pPr>
+            <w:r>
+              <w:rPr>
+                <w:rFonts w:ascii="Aptos" w:hAnsi="Aptos"/>
+                <w:b w:val="0"/>
+                <w:i w:val="0"/>
+                <w:color w:val="1A1A1A"/>
+                <w:sz w:val="20"/>
+              </w:rPr>
+              <w:t xml:space="preserve">c. 2560 BC</w:t>
+            </w:r>
+          </w:p>
+        </w:tc>
+        <w:tc>
+          <w:tcPr>
+            <w:tcW w:type="dxa" w:w="7087"/>
+            <w:tcBorders>
+              <w:top w:val="single" w:sz="4" w:space="0" w:color="D9C58A"/>
+              <w:left w:val="single" w:sz="4" w:space="0" w:color="D9C58A"/>
+              <w:bottom w:val="single" w:sz="4" w:space="0" w:color="D9C58A"/>
+              <w:right w:val="single" w:sz="4" w:space="0" w:color="D9C58A"/>
+            </w:tcBorders>
+            <w:tcMar>
+              <w:top w:w="80" w:type="dxa"/>
+              <w:left w:w="140" w:type="dxa"/>
+              <w:bottom w:w="80" w:type="dxa"/>
+              <w:right w:w="140" w:type="dxa"/>
+            </w:tcMar>
+          </w:tcPr>
+          <w:p>
+            <w:pPr>
+              <w:keepNext/>
+              <w:spacing w:after="0"/>
+            </w:pPr>
+            <w:r>
+              <w:rPr>
+                <w:rFonts w:ascii="Aptos" w:hAnsi="Aptos"/>
+                <w:b w:val="0"/>
+                <w:i w:val="0"/>
+                <w:color w:val="1A1A1A"/>
+                <w:sz w:val="20"/>
+              </w:rPr>
+              <w:t xml:space="preserve">The Great Pyramid of Khufu is completed at Giza.</w:t>
+            </w:r>
+          </w:p>
+        </w:tc>
+      </w:tr>
+      <w:tr>
+        <w:trPr>
+          <w:cantSplit/>
+        </w:trPr>
+        <w:tc>
+          <w:tcPr>
+            <w:tcW w:type="dxa" w:w="2154"/>
+            <w:tcBorders>
+              <w:top w:val="single" w:sz="4" w:space="0" w:color="D9C58A"/>
+              <w:left w:val="single" w:sz="4" w:space="0" w:color="D9C58A"/>
+              <w:bottom w:val="single" w:sz="4" w:space="0" w:color="D9C58A"/>
+              <w:right w:val="single" w:sz="4" w:space="0" w:color="D9C58A"/>
+            </w:tcBorders>
+            <w:tcMar>
+              <w:top w:w="80" w:type="dxa"/>
+              <w:left w:w="140" w:type="dxa"/>
+              <w:bottom w:w="80" w:type="dxa"/>
+              <w:right w:w="140" w:type="dxa"/>
+            </w:tcMar>
+          </w:tcPr>
+          <w:p>
+            <w:pPr>
+              <w:keepNext/>
+              <w:spacing w:after="0"/>
+            </w:pPr>
+            <w:r>
+              <w:rPr>
+                <w:rFonts w:ascii="Aptos" w:hAnsi="Aptos"/>
+                <w:b w:val="0"/>
+                <w:i w:val="0"/>
+                <w:color w:val="1A1A1A"/>
+                <w:sz w:val="20"/>
+              </w:rPr>
+              <w:t xml:space="preserve">c. 1550–1070 BC</w:t>
+            </w:r>
+          </w:p>
+        </w:tc>
+        <w:tc>
+          <w:tcPr>
+            <w:tcW w:type="dxa" w:w="7087"/>
+            <w:tcBorders>
+              <w:top w:val="single" w:sz="4" w:space="0" w:color="D9C58A"/>
+              <w:left w:val="single" w:sz="4" w:space="0" w:color="D9C58A"/>
+              <w:bottom w:val="single" w:sz="4" w:space="0" w:color="D9C58A"/>
+              <w:right w:val="single" w:sz="4" w:space="0" w:color="D9C58A"/>
+            </w:tcBorders>
+            <w:tcMar>
+              <w:top w:w="80" w:type="dxa"/>
+              <w:left w:w="140" w:type="dxa"/>
+              <w:bottom w:w="80" w:type="dxa"/>
+              <w:right w:w="140" w:type="dxa"/>
+            </w:tcMar>
+          </w:tcPr>
+          <w:p>
+            <w:pPr>
+              <w:keepNext/>
+              <w:spacing w:after="0"/>
+            </w:pPr>
+            <w:r>
+              <w:rPr>
+                <w:rFonts w:ascii="Aptos" w:hAnsi="Aptos"/>
+                <w:b w:val="0"/>
+                <w:i w:val="0"/>
+                <w:color w:val="1A1A1A"/>
+                <w:sz w:val="20"/>
+              </w:rPr>
+              <w:t xml:space="preserve">The New Kingdom: rulers include Hatshepsut, Akhenaten, Tutankhamun and Ramesses II.</w:t>
+            </w:r>
+          </w:p>
+        </w:tc>
+      </w:tr>
+      <w:tr>
+        <w:trPr>
+          <w:cantSplit/>
+        </w:trPr>
+        <w:tc>
+          <w:tcPr>
+            <w:tcW w:type="dxa" w:w="2154"/>
+            <w:tcBorders>
+              <w:top w:val="single" w:sz="4" w:space="0" w:color="D9C58A"/>
+              <w:left w:val="single" w:sz="4" w:space="0" w:color="D9C58A"/>
+              <w:bottom w:val="single" w:sz="4" w:space="0" w:color="D9C58A"/>
+              <w:right w:val="single" w:sz="4" w:space="0" w:color="D9C58A"/>
+            </w:tcBorders>
+            <w:tcMar>
+              <w:top w:w="80" w:type="dxa"/>
+              <w:left w:w="140" w:type="dxa"/>
+              <w:bottom w:w="80" w:type="dxa"/>
+              <w:right w:w="140" w:type="dxa"/>
+            </w:tcMar>
+          </w:tcPr>
+          <w:p>
+            <w:pPr>
+              <w:keepNext/>
+              <w:spacing w:after="0"/>
+            </w:pPr>
+            <w:r>
+              <w:rPr>
+                <w:rFonts w:ascii="Aptos" w:hAnsi="Aptos"/>
+                <w:b w:val="0"/>
+                <w:i w:val="0"/>
+                <w:color w:val="1A1A1A"/>
+                <w:sz w:val="20"/>
+              </w:rPr>
+              <w:t xml:space="preserve">c. 730 BC</w:t>
+            </w:r>
+          </w:p>
+        </w:tc>
+        <w:tc>
+          <w:tcPr>
+            <w:tcW w:type="dxa" w:w="7087"/>
+            <w:tcBorders>
+              <w:top w:val="single" w:sz="4" w:space="0" w:color="D9C58A"/>
+              <w:left w:val="single" w:sz="4" w:space="0" w:color="D9C58A"/>
+              <w:bottom w:val="single" w:sz="4" w:space="0" w:color="D9C58A"/>
+              <w:right w:val="single" w:sz="4" w:space="0" w:color="D9C58A"/>
+            </w:tcBorders>
+            <w:tcMar>
+              <w:top w:w="80" w:type="dxa"/>
+              <w:left w:w="140" w:type="dxa"/>
+              <w:bottom w:w="80" w:type="dxa"/>
+              <w:right w:w="140" w:type="dxa"/>
+            </w:tcMar>
+          </w:tcPr>
+          <w:p>
+            <w:pPr>
+              <w:keepNext/>
+              <w:spacing w:after="0"/>
+            </w:pPr>
+            <w:r>
+              <w:rPr>
+                <w:rFonts w:ascii="Aptos" w:hAnsi="Aptos"/>
+                <w:b w:val="0"/>
+                <w:i w:val="0"/>
+                <w:color w:val="1A1A1A"/>
+                <w:sz w:val="20"/>
+              </w:rPr>
+              <w:t xml:space="preserve">Piye of Kush (in modern Sudan) conquers Egypt. Kushite kings rule as the 25th Dynasty until about 656 BC.</w:t>
+            </w:r>
+          </w:p>
+        </w:tc>
+      </w:tr>
+      <w:tr>
+        <w:trPr>
+          <w:cantSplit/>
+        </w:trPr>
+        <w:tc>
+          <w:tcPr>
+            <w:tcW w:type="dxa" w:w="2154"/>
+            <w:tcBorders>
+              <w:top w:val="single" w:sz="4" w:space="0" w:color="D9C58A"/>
+              <w:left w:val="single" w:sz="4" w:space="0" w:color="D9C58A"/>
+              <w:bottom w:val="single" w:sz="4" w:space="0" w:color="D9C58A"/>
+              <w:right w:val="single" w:sz="4" w:space="0" w:color="D9C58A"/>
+            </w:tcBorders>
+            <w:tcMar>
+              <w:top w:w="80" w:type="dxa"/>
+              <w:left w:w="140" w:type="dxa"/>
+              <w:bottom w:w="80" w:type="dxa"/>
+              <w:right w:w="140" w:type="dxa"/>
+            </w:tcMar>
+          </w:tcPr>
+          <w:p>
+            <w:pPr>
+              <w:keepNext/>
+              <w:spacing w:after="0"/>
+            </w:pPr>
+            <w:r>
+              <w:rPr>
+                <w:rFonts w:ascii="Aptos" w:hAnsi="Aptos"/>
+                <w:b w:val="0"/>
+                <w:i w:val="0"/>
+                <w:color w:val="1A1A1A"/>
+                <w:sz w:val="20"/>
+              </w:rPr>
+              <w:t xml:space="preserve">30 BC</w:t>
+            </w:r>
+          </w:p>
+        </w:tc>
+        <w:tc>
+          <w:tcPr>
+            <w:tcW w:type="dxa" w:w="7087"/>
+            <w:tcBorders>
+              <w:top w:val="single" w:sz="4" w:space="0" w:color="D9C58A"/>
+              <w:left w:val="single" w:sz="4" w:space="0" w:color="D9C58A"/>
+              <w:bottom w:val="single" w:sz="4" w:space="0" w:color="D9C58A"/>
+              <w:right w:val="single" w:sz="4" w:space="0" w:color="D9C58A"/>
+            </w:tcBorders>
+            <w:tcMar>
+              <w:top w:w="80" w:type="dxa"/>
+              <w:left w:w="140" w:type="dxa"/>
+              <w:bottom w:w="80" w:type="dxa"/>
+              <w:right w:w="140" w:type="dxa"/>
+            </w:tcMar>
+          </w:tcPr>
+          <w:p>
+            <w:pPr>
+              <w:keepNext/>
+              <w:spacing w:after="0"/>
+            </w:pPr>
+            <w:r>
+              <w:rPr>
+                <w:rFonts w:ascii="Aptos" w:hAnsi="Aptos"/>
+                <w:b w:val="0"/>
+                <w:i w:val="0"/>
+                <w:color w:val="1A1A1A"/>
+                <w:sz w:val="20"/>
+              </w:rPr>
+              <w:t xml:space="preserve">After the death of Cleopatra VII, Egypt becomes a province of Rome.</w:t>
+            </w:r>
+          </w:p>
+        </w:tc>
+      </w:tr>
+      <w:tr>
+        <w:trPr>
+          <w:cantSplit/>
+        </w:trPr>
+        <w:tc>
+          <w:tcPr>
+            <w:tcW w:type="dxa" w:w="2154"/>
+            <w:tcBorders>
+              <w:top w:val="single" w:sz="4" w:space="0" w:color="D9C58A"/>
+              <w:left w:val="single" w:sz="4" w:space="0" w:color="D9C58A"/>
+              <w:bottom w:val="single" w:sz="4" w:space="0" w:color="D9C58A"/>
+              <w:right w:val="single" w:sz="4" w:space="0" w:color="D9C58A"/>
+            </w:tcBorders>
+            <w:tcMar>
+              <w:top w:w="80" w:type="dxa"/>
+              <w:left w:w="140" w:type="dxa"/>
+              <w:bottom w:w="80" w:type="dxa"/>
+              <w:right w:w="140" w:type="dxa"/>
+            </w:tcMar>
+          </w:tcPr>
+          <w:p>
+            <w:pPr>
+              <w:keepNext/>
+              <w:spacing w:after="0"/>
+            </w:pPr>
+            <w:r>
+              <w:rPr>
+                <w:rFonts w:ascii="Aptos" w:hAnsi="Aptos"/>
+                <w:b w:val="0"/>
+                <w:i w:val="0"/>
+                <w:color w:val="1A1A1A"/>
+                <w:sz w:val="20"/>
+              </w:rPr>
+              <w:t xml:space="preserve">Today</w:t>
+            </w:r>
+          </w:p>
+        </w:tc>
+        <w:tc>
+          <w:tcPr>
+            <w:tcW w:type="dxa" w:w="7087"/>
+            <w:tcBorders>
+              <w:top w:val="single" w:sz="4" w:space="0" w:color="D9C58A"/>
+              <w:left w:val="single" w:sz="4" w:space="0" w:color="D9C58A"/>
+              <w:bottom w:val="single" w:sz="4" w:space="0" w:color="D9C58A"/>
+              <w:right w:val="single" w:sz="4" w:space="0" w:color="D9C58A"/>
+            </w:tcBorders>
+            <w:tcMar>
+              <w:top w:w="80" w:type="dxa"/>
+              <w:left w:w="140" w:type="dxa"/>
+              <w:bottom w:w="80" w:type="dxa"/>
+              <w:right w:w="140" w:type="dxa"/>
+            </w:tcMar>
+          </w:tcPr>
+          <w:p>
+            <w:pPr>
+              <w:keepNext/>
+              <w:spacing w:after="0"/>
+            </w:pPr>
+            <w:r>
+              <w:rPr>
+                <w:rFonts w:ascii="Aptos" w:hAnsi="Aptos"/>
+                <w:b w:val="0"/>
+                <w:i w:val="0"/>
+                <w:color w:val="1A1A1A"/>
+                <w:sz w:val="20"/>
+              </w:rPr>
+              <w:t xml:space="preserve">Sudan has around 200 pyramids, more than Egypt, many at Meroë.</w:t>
+            </w:r>
+          </w:p>
+        </w:tc>
+      </w:tr>
+      <w:tr>
+        <w:trPr>
+          <w:cantSplit/>
+        </w:trPr>
+        <w:tc>
+          <w:tcPr>
+            <w:tcW w:type="dxa" w:w="2154"/>
+            <w:tcBorders>
+              <w:top w:val="single" w:sz="4" w:space="0" w:color="D9C58A"/>
+              <w:left w:val="single" w:sz="4" w:space="0" w:color="D9C58A"/>
+              <w:bottom w:val="single" w:sz="4" w:space="0" w:color="D9C58A"/>
+              <w:right w:val="single" w:sz="4" w:space="0" w:color="D9C58A"/>
+            </w:tcBorders>
+            <w:tcMar>
+              <w:top w:w="80" w:type="dxa"/>
+              <w:left w:w="140" w:type="dxa"/>
+              <w:bottom w:w="80" w:type="dxa"/>
+              <w:right w:w="140" w:type="dxa"/>
+            </w:tcMar>
+          </w:tcPr>
+          <w:p>
+            <w:pPr>
+              <w:spacing w:after="0"/>
+            </w:pPr>
+            <w:r>
+              <w:rPr>
+                <w:rFonts w:ascii="Aptos" w:hAnsi="Aptos"/>
+                <w:b w:val="0"/>
+                <w:i w:val="0"/>
+                <w:color w:val="1A1A1A"/>
+                <w:sz w:val="20"/>
+              </w:rPr>
+              <w:t xml:space="preserve">Staff note</w:t>
+            </w:r>
+          </w:p>
+        </w:tc>
+        <w:tc>
+          <w:tcPr>
+            <w:tcW w:type="dxa" w:w="7087"/>
+            <w:tcBorders>
+              <w:top w:val="single" w:sz="4" w:space="0" w:color="D9C58A"/>
+              <w:left w:val="single" w:sz="4" w:space="0" w:color="D9C58A"/>
+              <w:bottom w:val="single" w:sz="4" w:space="0" w:color="D9C58A"/>
+              <w:right w:val="single" w:sz="4" w:space="0" w:color="D9C58A"/>
+            </w:tcBorders>
+            <w:tcMar>
+              <w:top w:w="80" w:type="dxa"/>
+              <w:left w:w="140" w:type="dxa"/>
+              <w:bottom w:w="80" w:type="dxa"/>
+              <w:right w:w="140" w:type="dxa"/>
+            </w:tcMar>
+          </w:tcPr>
+          <w:p>
+            <w:pPr>
+              <w:spacing w:after="0"/>
+            </w:pPr>
+            <w:r>
+              <w:rPr>
+                <w:rFonts w:ascii="Aptos" w:hAnsi="Aptos"/>
+                <w:b w:val="0"/>
+                <w:i w:val="0"/>
+                <w:color w:val="1A1A1A"/>
+                <w:sz w:val="20"/>
+              </w:rPr>
+              <w:t xml:space="preserve">Ancient Egyptians were an African people of the Nile valley with a range of skin tones. Avoid overclaiming that they all looked one way; the point is that Kemet was an African civilisation.</w:t>
+            </w:r>
+          </w:p>
+        </w:tc>
+      </w:tr>
+    </w:tbl>
+    <w:p>
+      <w:pPr>
+        <w:spacing w:after="0" w:line="160" w:lineRule="exact"/>
+      </w:pPr>
+      <w:r>
+        <w:rPr>
+          <w:sz w:val="4"/>
+        </w:rPr>
+      </w:r>
+    </w:p>
+    <w:p>
+      <w:pPr>
+        <w:keepNext/>
+        <w:pBdr>
+          <w:top w:val="single" w:sz="4" w:space="4" w:color="007A3D"/>
+          <w:left w:val="single" w:sz="4" w:space="6" w:color="007A3D"/>
+          <w:bottom w:val="single" w:sz="4" w:space="4" w:color="007A3D"/>
+          <w:right w:val="single" w:sz="4" w:space="6" w:color="007A3D"/>
+        </w:pBdr>
+        <w:shd w:val="clear" w:color="auto" w:fill="007A3D"/>
+        <w:spacing w:before="200" w:after="120"/>
+        <w:ind w:left="68" w:right="68"/>
+      </w:pPr>
+      <w:r>
+        <w:rPr>
+          <w:rFonts w:ascii="Aptos Display" w:hAnsi="Aptos Display"/>
+          <w:b/>
+          <w:i w:val="0"/>
+          <w:color w:val="FFFFFF"/>
+          <w:sz w:val="27"/>
+        </w:rPr>
+        <w:t>6.  Delivery Notes</w:t>
       </w:r>
     </w:p>
     <w:p>
@@ -1603,12 +2288,12 @@
       <w:pPr>
         <w:keepNext/>
         <w:pBdr>
-          <w:top w:val="single" w:sz="4" w:space="4" w:color="007A3D"/>
-          <w:left w:val="single" w:sz="4" w:space="6" w:color="007A3D"/>
-          <w:bottom w:val="single" w:sz="4" w:space="4" w:color="007A3D"/>
-          <w:right w:val="single" w:sz="4" w:space="6" w:color="007A3D"/>
+          <w:top w:val="single" w:sz="4" w:space="4" w:color="CE1126"/>
+          <w:left w:val="single" w:sz="4" w:space="6" w:color="CE1126"/>
+          <w:bottom w:val="single" w:sz="4" w:space="4" w:color="CE1126"/>
+          <w:right w:val="single" w:sz="4" w:space="6" w:color="CE1126"/>
         </w:pBdr>
-        <w:shd w:val="clear" w:color="auto" w:fill="007A3D"/>
+        <w:shd w:val="clear" w:color="auto" w:fill="CE1126"/>
         <w:spacing w:before="200" w:after="120"/>
         <w:ind w:left="68" w:right="68"/>
       </w:pPr>
@@ -1620,7 +2305,7 @@
           <w:color w:val="FFFFFF"/>
           <w:sz w:val="27"/>
         </w:rPr>
-        <w:t>6.  Answer Key</w:t>
+        <w:t>7.  Answer Key</w:t>
       </w:r>
     </w:p>
     <w:p>
@@ -3192,12 +3877,12 @@
       <w:pPr>
         <w:keepNext/>
         <w:pBdr>
-          <w:top w:val="single" w:sz="4" w:space="4" w:color="CE1126"/>
-          <w:left w:val="single" w:sz="4" w:space="6" w:color="CE1126"/>
-          <w:bottom w:val="single" w:sz="4" w:space="4" w:color="CE1126"/>
-          <w:right w:val="single" w:sz="4" w:space="6" w:color="CE1126"/>
+          <w:top w:val="single" w:sz="4" w:space="4" w:color="E8A800"/>
+          <w:left w:val="single" w:sz="4" w:space="6" w:color="E8A800"/>
+          <w:bottom w:val="single" w:sz="4" w:space="4" w:color="E8A800"/>
+          <w:right w:val="single" w:sz="4" w:space="6" w:color="E8A800"/>
         </w:pBdr>
-        <w:shd w:val="clear" w:color="auto" w:fill="CE1126"/>
+        <w:shd w:val="clear" w:color="auto" w:fill="E8A800"/>
         <w:spacing w:before="200" w:after="120"/>
         <w:ind w:left="68" w:right="68"/>
       </w:pPr>
@@ -3206,10 +3891,10 @@
           <w:rFonts w:ascii="Aptos Display" w:hAnsi="Aptos Display"/>
           <w:b/>
           <w:i w:val="0"/>
-          <w:color w:val="FFFFFF"/>
+          <w:color w:val="1A1A1A"/>
           <w:sz w:val="27"/>
         </w:rPr>
-        <w:t>7.  Sensitivity &amp; Safeguarding</w:t>
+        <w:t>8.  Sensitivity &amp; Safeguarding</w:t>
       </w:r>
     </w:p>
     <w:tbl>
@@ -3305,12 +3990,12 @@
       <w:pPr>
         <w:keepNext/>
         <w:pBdr>
-          <w:top w:val="single" w:sz="4" w:space="4" w:color="E8A800"/>
-          <w:left w:val="single" w:sz="4" w:space="6" w:color="E8A800"/>
-          <w:bottom w:val="single" w:sz="4" w:space="4" w:color="E8A800"/>
-          <w:right w:val="single" w:sz="4" w:space="6" w:color="E8A800"/>
+          <w:top w:val="single" w:sz="4" w:space="4" w:color="007A3D"/>
+          <w:left w:val="single" w:sz="4" w:space="6" w:color="007A3D"/>
+          <w:bottom w:val="single" w:sz="4" w:space="4" w:color="007A3D"/>
+          <w:right w:val="single" w:sz="4" w:space="6" w:color="007A3D"/>
         </w:pBdr>
-        <w:shd w:val="clear" w:color="auto" w:fill="E8A800"/>
+        <w:shd w:val="clear" w:color="auto" w:fill="007A3D"/>
         <w:spacing w:before="200" w:after="120"/>
         <w:ind w:left="68" w:right="68"/>
       </w:pPr>
@@ -3319,10 +4004,10 @@
           <w:rFonts w:ascii="Aptos Display" w:hAnsi="Aptos Display"/>
           <w:b/>
           <w:i w:val="0"/>
-          <w:color w:val="1A1A1A"/>
+          <w:color w:val="FFFFFF"/>
           <w:sz w:val="27"/>
         </w:rPr>
-        <w:t>8.  Extension Ideas</w:t>
+        <w:t>9.  Extension Ideas</w:t>
       </w:r>
     </w:p>
     <w:p>

</xml_diff>